<commit_message>
Complete Steven Uiterwyk attachment set (28 files)
Pulled remaining attachments from Apple Mail's Attachments store:
2025 EOY balance sheet/income statement/cash flow PDFs, 5/22 Crystal
financial reporting spreadsheets, Intellidealer system docs, and more.
Supersedes the partial 5-file set.
</commit_message>
<xml_diff>
--- a/attachments/steven-uiterwyk/Crystal Tractor Maintenance Plan 4-1.docx
+++ b/attachments/steven-uiterwyk/Crystal Tractor Maintenance Plan 4-1.docx
@@ -12156,7 +12156,42 @@
           <w:sz w:val="16"/>
           <w:szCs w:val="16"/>
         </w:rPr>
-        <w:t>If included in the Agreement, Field / On Site Servicing must be at a location within 40 miles of physical dealership location owner or operated by the Administrator.</w:t>
+        <w:t xml:space="preserve">Generally, the services covered by this Agreement are only available if the equipment is delivered to a Repair Facility at the cost and </w:t>
+      </w:r>
+      <w:r>
+        <w:rPr>
+          <w:sz w:val="16"/>
+          <w:szCs w:val="16"/>
+        </w:rPr>
+        <w:t xml:space="preserve">by </w:t>
+      </w:r>
+      <w:r>
+        <w:rPr>
+          <w:sz w:val="16"/>
+          <w:szCs w:val="16"/>
+        </w:rPr>
+        <w:t xml:space="preserve">arrangement of the Customer.  </w:t>
+      </w:r>
+      <w:r>
+        <w:rPr>
+          <w:sz w:val="16"/>
+          <w:szCs w:val="16"/>
+        </w:rPr>
+        <w:t>If included in the Agreement, Field / On Site Servicing must be at a location within 40 miles of physical dealership location owne</w:t>
+      </w:r>
+      <w:r>
+        <w:rPr>
+          <w:sz w:val="16"/>
+          <w:szCs w:val="16"/>
+        </w:rPr>
+        <w:t>d</w:t>
+      </w:r>
+      <w:r>
+        <w:rPr>
+          <w:sz w:val="16"/>
+          <w:szCs w:val="16"/>
+        </w:rPr>
+        <w:t xml:space="preserve"> or operated by the Administrator.</w:t>
       </w:r>
     </w:p>
     <w:p>
@@ -12651,7 +12686,19 @@
               <w:rPr>
                 <w:sz w:val="16"/>
               </w:rPr>
-              <w:t>ield / On Site Servicing must be at a location within 40 miles of physical dealership location owne</w:t>
+              <w:t xml:space="preserve">ield / On Site Servicing must be at a location within 40 miles of </w:t>
+            </w:r>
+            <w:r>
+              <w:rPr>
+                <w:sz w:val="16"/>
+              </w:rPr>
+              <w:t xml:space="preserve">a </w:t>
+            </w:r>
+            <w:r>
+              <w:rPr>
+                <w:sz w:val="16"/>
+              </w:rPr>
+              <w:t>physical dealership location owne</w:t>
             </w:r>
             <w:r>
               <w:rPr>

</xml_diff>